<commit_message>
Actualiza GDD en Word
</commit_message>
<xml_diff>
--- a/DOCS/TP Final- Facundo Bastida.docx
+++ b/DOCS/TP Final- Facundo Bastida.docx
@@ -1,6 +1,6 @@
 
 <file path=word/document.xml><?xml version="1.0" encoding="utf-8"?>
-<w:document xmlns:wpc="http://schemas.microsoft.com/office/word/2010/wordprocessingCanvas" xmlns:cx="http://schemas.microsoft.com/office/drawing/2014/chartex" xmlns:mc="http://schemas.openxmlformats.org/markup-compatibility/2006" xmlns:o="urn:schemas-microsoft-com:office:office" xmlns:r="http://schemas.openxmlformats.org/officeDocument/2006/relationships" xmlns:m="http://schemas.openxmlformats.org/officeDocument/2006/math" xmlns:v="urn:schemas-microsoft-com:vml" xmlns:wp14="http://schemas.microsoft.com/office/word/2010/wordprocessingDrawing" xmlns:wp="http://schemas.openxmlformats.org/drawingml/2006/wordprocessingDrawing" xmlns:w10="urn:schemas-microsoft-com:office:word" xmlns:w="http://schemas.openxmlformats.org/wordprocessingml/2006/main" xmlns:w14="http://schemas.microsoft.com/office/word/2010/wordml" xmlns:w15="http://schemas.microsoft.com/office/word/2012/wordml" xmlns:w16se="http://schemas.microsoft.com/office/word/2015/wordml/symex" xmlns:wpg="http://schemas.microsoft.com/office/word/2010/wordprocessingGroup" xmlns:wpi="http://schemas.microsoft.com/office/word/2010/wordprocessingInk" xmlns:wne="http://schemas.microsoft.com/office/word/2006/wordml" xmlns:wps="http://schemas.microsoft.com/office/word/2010/wordprocessingShape" mc:Ignorable="w14 w15 w16se wp14">
+<w:document xmlns:wpc="http://schemas.microsoft.com/office/word/2010/wordprocessingCanvas" xmlns:cx="http://schemas.microsoft.com/office/drawing/2014/chartex" xmlns:cx1="http://schemas.microsoft.com/office/drawing/2015/9/8/chartex" xmlns:cx2="http://schemas.microsoft.com/office/drawing/2015/10/21/chartex" xmlns:cx3="http://schemas.microsoft.com/office/drawing/2016/5/9/chartex" xmlns:cx4="http://schemas.microsoft.com/office/drawing/2016/5/10/chartex" xmlns:cx5="http://schemas.microsoft.com/office/drawing/2016/5/11/chartex" xmlns:cx6="http://schemas.microsoft.com/office/drawing/2016/5/12/chartex" xmlns:cx7="http://schemas.microsoft.com/office/drawing/2016/5/13/chartex" xmlns:cx8="http://schemas.microsoft.com/office/drawing/2016/5/14/chartex" xmlns:mc="http://schemas.openxmlformats.org/markup-compatibility/2006" xmlns:aink="http://schemas.microsoft.com/office/drawing/2016/ink" xmlns:am3d="http://schemas.microsoft.com/office/drawing/2017/model3d" xmlns:o="urn:schemas-microsoft-com:office:office" xmlns:oel="http://schemas.microsoft.com/office/2019/extlst" xmlns:r="http://schemas.openxmlformats.org/officeDocument/2006/relationships" xmlns:m="http://schemas.openxmlformats.org/officeDocument/2006/math" xmlns:v="urn:schemas-microsoft-com:vml" xmlns:wp14="http://schemas.microsoft.com/office/word/2010/wordprocessingDrawing" xmlns:wp="http://schemas.openxmlformats.org/drawingml/2006/wordprocessingDrawing" xmlns:w10="urn:schemas-microsoft-com:office:word" xmlns:w="http://schemas.openxmlformats.org/wordprocessingml/2006/main" xmlns:w14="http://schemas.microsoft.com/office/word/2010/wordml" xmlns:w15="http://schemas.microsoft.com/office/word/2012/wordml" xmlns:w16cex="http://schemas.microsoft.com/office/word/2018/wordml/cex" xmlns:w16cid="http://schemas.microsoft.com/office/word/2016/wordml/cid" xmlns:w16="http://schemas.microsoft.com/office/word/2018/wordml" xmlns:w16sdtdh="http://schemas.microsoft.com/office/word/2020/wordml/sdtdatahash" xmlns:w16se="http://schemas.microsoft.com/office/word/2015/wordml/symex" xmlns:wpg="http://schemas.microsoft.com/office/word/2010/wordprocessingGroup" xmlns:wpi="http://schemas.microsoft.com/office/word/2010/wordprocessingInk" xmlns:wne="http://schemas.microsoft.com/office/word/2006/wordml" xmlns:wps="http://schemas.microsoft.com/office/word/2010/wordprocessingShape" mc:Ignorable="w14 w15 w16se w16cid w16 w16cex w16sdtdh wp14">
   <w:body>
     <w:sdt>
       <w:sdtPr>
@@ -19,7 +19,7 @@
             <mc:AlternateContent>
               <mc:Choice Requires="wps">
                 <w:drawing>
-                  <wp:anchor distT="0" distB="0" distL="114300" distR="114300" simplePos="0" relativeHeight="251664384" behindDoc="0" locked="0" layoutInCell="1" allowOverlap="1" wp14:anchorId="49FA0124" wp14:editId="170A8DD5">
+                  <wp:anchor distT="0" distB="0" distL="114300" distR="114300" simplePos="0" relativeHeight="251664384" behindDoc="0" locked="0" layoutInCell="1" allowOverlap="1" wp14:anchorId="48D539D7" wp14:editId="3718CD9D">
                     <wp:simplePos x="0" y="0"/>
                     <wp:positionH relativeFrom="column">
                       <wp:posOffset>-140970</wp:posOffset>
@@ -107,7 +107,7 @@
               </mc:Choice>
               <mc:Fallback>
                 <w:pict>
-                  <v:rect w14:anchorId="49FA0124" id="Rectángulo 11" o:spid="_x0000_s1026" style="position:absolute;left:0;text-align:left;margin-left:-11.1pt;margin-top:-8.85pt;width:538.85pt;height:298.4pt;z-index:251664384;visibility:visible;mso-wrap-style:square;mso-wrap-distance-left:9pt;mso-wrap-distance-top:0;mso-wrap-distance-right:9pt;mso-wrap-distance-bottom:0;mso-position-horizontal:absolute;mso-position-horizontal-relative:text;mso-position-vertical:absolute;mso-position-vertical-relative:text;v-text-anchor:bottom" o:gfxdata="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" filled="f" stroked="f">
+                  <v:rect w14:anchorId="48D539D7" id="Rectángulo 11" o:spid="_x0000_s1026" style="position:absolute;left:0;text-align:left;margin-left:-11.1pt;margin-top:-8.85pt;width:538.85pt;height:298.4pt;z-index:251664384;visibility:visible;mso-wrap-style:square;mso-wrap-distance-left:9pt;mso-wrap-distance-top:0;mso-wrap-distance-right:9pt;mso-wrap-distance-bottom:0;mso-position-horizontal:absolute;mso-position-horizontal-relative:text;mso-position-vertical:absolute;mso-position-vertical-relative:text;v-text-anchor:bottom" o:gfxdata="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" filled="f" stroked="f">
                     <v:textbox inset="54pt,0,1in,0">
                       <w:txbxContent>
                         <w:p>
@@ -167,7 +167,7 @@
             <mc:AlternateContent>
               <mc:Choice Requires="wpg">
                 <w:drawing>
-                  <wp:anchor distT="0" distB="0" distL="114300" distR="114300" simplePos="0" relativeHeight="251662336" behindDoc="0" locked="0" layoutInCell="1" allowOverlap="1">
+                  <wp:anchor distT="0" distB="0" distL="114300" distR="114300" simplePos="0" relativeHeight="251662336" behindDoc="0" locked="0" layoutInCell="1" allowOverlap="1" wp14:anchorId="4D94D813" wp14:editId="62323B26">
                     <wp:simplePos x="0" y="0"/>
                     <wp:positionH relativeFrom="page">
                       <wp:align>center</wp:align>
@@ -444,7 +444,7 @@
             <mc:AlternateContent>
               <mc:Choice Requires="wps">
                 <w:drawing>
-                  <wp:anchor distT="0" distB="0" distL="114300" distR="114300" simplePos="0" relativeHeight="251659264" behindDoc="0" locked="0" layoutInCell="1" allowOverlap="1">
+                  <wp:anchor distT="0" distB="0" distL="114300" distR="114300" simplePos="0" relativeHeight="251659264" behindDoc="0" locked="0" layoutInCell="1" allowOverlap="1" wp14:anchorId="3C141060" wp14:editId="68C4F81B">
                     <wp:simplePos x="0" y="0"/>
                     <wp:positionH relativeFrom="page">
                       <wp:align>center</wp:align>
@@ -567,11 +567,11 @@
               </mc:Choice>
               <mc:Fallback>
                 <w:pict>
-                  <v:shapetype id="_x0000_t202" coordsize="21600,21600" o:spt="202" path="m,l,21600r21600,l21600,xe">
+                  <v:shapetype w14:anchorId="3C141060" id="_x0000_t202" coordsize="21600,21600" o:spt="202" path="m,l,21600r21600,l21600,xe">
                     <v:stroke joinstyle="miter"/>
                     <v:path gradientshapeok="t" o:connecttype="rect"/>
                   </v:shapetype>
-                  <v:shape id="Cuadro de texto 154" o:spid="_x0000_s1027" type="#_x0000_t202" style="position:absolute;left:0;text-align:left;margin-left:0;margin-top:0;width:8in;height:286.5pt;z-index:251659264;visibility:visible;mso-wrap-style:square;mso-width-percent:941;mso-height-percent:363;mso-top-percent:300;mso-wrap-distance-left:9pt;mso-wrap-distance-top:0;mso-wrap-distance-right:9pt;mso-wrap-distance-bottom:0;mso-position-horizontal:center;mso-position-horizontal-relative:page;mso-position-vertical-relative:page;mso-width-percent:941;mso-height-percent:363;mso-top-percent:300;mso-width-relative:page;mso-height-relative:page;v-text-anchor:bottom" o:gfxdata="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" filled="f" stroked="f" strokeweight=".5pt">
+                  <v:shape id="Cuadro de texto 154" o:spid="_x0000_s1027" type="#_x0000_t202" style="position:absolute;left:0;text-align:left;margin-left:0;margin-top:0;width:8in;height:286.5pt;z-index:251659264;visibility:visible;mso-wrap-style:square;mso-width-percent:941;mso-height-percent:363;mso-top-percent:300;mso-wrap-distance-left:9pt;mso-wrap-distance-top:0;mso-wrap-distance-right:9pt;mso-wrap-distance-bottom:0;mso-position-horizontal:center;mso-position-horizontal-relative:page;mso-position-vertical-relative:page;mso-width-percent:941;mso-height-percent:363;mso-top-percent:300;mso-width-relative:page;mso-height-relative:page;v-text-anchor:bottom" o:gfxdata="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" filled="f" stroked="f" strokeweight=".5pt">
                     <v:textbox inset="126pt,0,54pt,0">
                       <w:txbxContent>
                         <w:p>
@@ -640,8 +640,6 @@
         <w:lastRenderedPageBreak/>
         <w:t>Índice:</w:t>
       </w:r>
-      <w:bookmarkStart w:id="0" w:name="_GoBack"/>
-      <w:bookmarkEnd w:id="0"/>
     </w:p>
     <w:p/>
     <w:p>
@@ -682,7 +680,6 @@
           <w:docPartUnique/>
         </w:docPartObj>
       </w:sdtPr>
-      <w:sdtEndPr/>
       <w:sdtContent>
         <w:p>
           <w:pPr>
@@ -872,70 +869,58 @@
       <w:pPr>
         <w:pStyle w:val="Ttulo1"/>
       </w:pPr>
-      <w:bookmarkStart w:id="1" w:name="_heading=h.dzj930j2tsh1" w:colFirst="0" w:colLast="0"/>
+      <w:bookmarkStart w:id="0" w:name="_heading=h.dzj930j2tsh1" w:colFirst="0" w:colLast="0"/>
+      <w:bookmarkEnd w:id="0"/>
+      <w:r>
+        <w:lastRenderedPageBreak/>
+        <w:t>Concepto:</w:t>
+      </w:r>
+    </w:p>
+    <w:p>
+      <w:r>
+        <w:t xml:space="preserve">Rouge </w:t>
+      </w:r>
+      <w:proofErr w:type="spellStart"/>
+      <w:r>
+        <w:t>Egg</w:t>
+      </w:r>
+      <w:proofErr w:type="spellEnd"/>
+      <w:r>
+        <w:t xml:space="preserve"> es un juego de acción y aventura “</w:t>
+      </w:r>
+      <w:proofErr w:type="spellStart"/>
+      <w:r>
+        <w:t>Rougelike</w:t>
+      </w:r>
+      <w:proofErr w:type="spellEnd"/>
+      <w:r>
+        <w:t xml:space="preserve">” desarrollado en </w:t>
+      </w:r>
+      <w:proofErr w:type="spellStart"/>
+      <w:r>
+        <w:t>Phaser</w:t>
+      </w:r>
+      <w:proofErr w:type="spellEnd"/>
+      <w:r>
+        <w:t xml:space="preserve"> 3 y </w:t>
+      </w:r>
+      <w:proofErr w:type="spellStart"/>
+      <w:r>
+        <w:t>NodeJS</w:t>
+      </w:r>
+      <w:proofErr w:type="spellEnd"/>
+      <w:r>
+        <w:t>. El jugador controla a un héroe que se infiltra en la guarida de unos pollos mutantes, atravesando mazmorras generadas al azar.</w:t>
+      </w:r>
+    </w:p>
+    <w:p>
+      <w:pPr>
+        <w:pStyle w:val="Ttulo1"/>
+      </w:pPr>
+      <w:bookmarkStart w:id="1" w:name="_heading=h.obqtz76i3spd" w:colFirst="0" w:colLast="0"/>
       <w:bookmarkEnd w:id="1"/>
       <w:r>
-        <w:lastRenderedPageBreak/>
-        <w:t>C</w:t>
-      </w:r>
-      <w:r>
-        <w:t>oncepto</w:t>
-      </w:r>
-      <w:r>
-        <w:t>:</w:t>
-      </w:r>
-    </w:p>
-    <w:p>
-      <w:r>
-        <w:t xml:space="preserve">Rouge </w:t>
-      </w:r>
-      <w:proofErr w:type="spellStart"/>
-      <w:r>
-        <w:t>Egg</w:t>
-      </w:r>
-      <w:proofErr w:type="spellEnd"/>
-      <w:r>
-        <w:t xml:space="preserve"> es un juego de acción y aventura “</w:t>
-      </w:r>
-      <w:proofErr w:type="spellStart"/>
-      <w:r>
-        <w:t>Rougelike</w:t>
-      </w:r>
-      <w:proofErr w:type="spellEnd"/>
-      <w:r>
-        <w:t xml:space="preserve">” desarrollado en </w:t>
-      </w:r>
-      <w:proofErr w:type="spellStart"/>
-      <w:r>
-        <w:t>Phaser</w:t>
-      </w:r>
-      <w:proofErr w:type="spellEnd"/>
-      <w:r>
-        <w:t xml:space="preserve"> 3 y </w:t>
-      </w:r>
-      <w:proofErr w:type="spellStart"/>
-      <w:r>
-        <w:t>NodeJS</w:t>
-      </w:r>
-      <w:proofErr w:type="spellEnd"/>
-      <w:r>
-        <w:t>. El jugador controla a un héroe que se infiltra en la guarida de unos pollos mutantes, atravesando</w:t>
-      </w:r>
-      <w:r>
-        <w:t xml:space="preserve"> mazmorras generadas al azar.</w:t>
-      </w:r>
-    </w:p>
-    <w:p>
-      <w:pPr>
-        <w:pStyle w:val="Ttulo1"/>
-      </w:pPr>
-      <w:bookmarkStart w:id="2" w:name="_heading=h.obqtz76i3spd" w:colFirst="0" w:colLast="0"/>
-      <w:bookmarkEnd w:id="2"/>
-      <w:r>
-        <w:t>C</w:t>
-      </w:r>
-      <w:r>
-        <w:t>ontroles del jugador (cuadrado azul):</w:t>
+        <w:t>Controles del jugador (cuadrado azul):</w:t>
       </w:r>
     </w:p>
     <w:p/>
@@ -948,7 +933,7 @@
           <w:noProof/>
         </w:rPr>
         <w:drawing>
-          <wp:inline distT="0" distB="0" distL="0" distR="0">
+          <wp:inline distT="0" distB="0" distL="0" distR="0" wp14:anchorId="676F1DB7" wp14:editId="2CD3E3A0">
             <wp:extent cx="990738" cy="571580"/>
             <wp:effectExtent l="0" t="0" r="0" b="0"/>
             <wp:docPr id="50" name="image3.png"/>
@@ -1056,7 +1041,10 @@
               <w:jc w:val="center"/>
             </w:pPr>
             <w:r>
-              <w:t>FLECHA IZQUIERDA</w:t>
+              <w:t xml:space="preserve">FLECHA </w:t>
+            </w:r>
+            <w:r>
+              <w:t>DERECHA</w:t>
             </w:r>
           </w:p>
         </w:tc>
@@ -1087,7 +1075,10 @@
               </w:rPr>
             </w:pPr>
             <w:r>
-              <w:t>FLECHA DERECHA</w:t>
+              <w:t xml:space="preserve">FLECHA </w:t>
+            </w:r>
+            <w:r>
+              <w:t>IZQUIERDA</w:t>
             </w:r>
           </w:p>
         </w:tc>
@@ -1239,80 +1230,65 @@
       <w:pPr>
         <w:pStyle w:val="Ttulo1"/>
       </w:pPr>
-      <w:bookmarkStart w:id="3" w:name="_heading=h.ksjprq9iutug" w:colFirst="0" w:colLast="0"/>
+      <w:bookmarkStart w:id="2" w:name="_heading=h.ksjprq9iutug" w:colFirst="0" w:colLast="0"/>
+      <w:bookmarkEnd w:id="2"/>
+      <w:r>
+        <w:t>Objetivo del Juego:</w:t>
+      </w:r>
+    </w:p>
+    <w:p>
+      <w:r>
+        <w:t xml:space="preserve">Superar los niveles generados </w:t>
+      </w:r>
+      <w:proofErr w:type="spellStart"/>
+      <w:r>
+        <w:t>proceduralmente</w:t>
+      </w:r>
+      <w:proofErr w:type="spellEnd"/>
+      <w:r>
+        <w:t>, acumulando puntos y experiencia eliminando enemigos y recogiendo tesoros. Evitando perder todas las vidas por las trampas y enemigos.</w:t>
+      </w:r>
+    </w:p>
+    <w:p>
+      <w:pPr>
+        <w:pStyle w:val="Ttulo1"/>
+      </w:pPr>
+      <w:bookmarkStart w:id="3" w:name="_heading=h.solbrmxt962v" w:colFirst="0" w:colLast="0"/>
       <w:bookmarkEnd w:id="3"/>
       <w:r>
-        <w:t>O</w:t>
-      </w:r>
-      <w:r>
-        <w:t>bjetivo del Juego:</w:t>
-      </w:r>
-    </w:p>
-    <w:p>
-      <w:r>
-        <w:t xml:space="preserve">Superar los niveles generados </w:t>
-      </w:r>
+        <w:t>Mecánicas Principales:</w:t>
+      </w:r>
+    </w:p>
+    <w:p>
+      <w:r>
+        <w:t>- Dificultad Progresiva: 5 niveles que aumentan en escala y variedad de obstáculos.</w:t>
+      </w:r>
+    </w:p>
+    <w:p>
+      <w:r>
+        <w:t>- Sistema de Salud y Vidas: El jugador cuenta con 3 corazones de salud. Al agotarse, pierde una de sus 3 vidas totales y reaparece con salud completa.</w:t>
+      </w:r>
+    </w:p>
+    <w:p>
+      <w:r>
+        <w:t>- Aumento de nivel: Recoger suficientes puntos otorga una vida extra e incrementa el nivel del jugador, dándole la opción de elegir una bonificación a sus estadísticas.</w:t>
+      </w:r>
+    </w:p>
+    <w:p>
+      <w:r>
+        <w:t>- Persistencia: La puntuación, salud, experiencia y vidas se mantienen al avanzar entre los cinco niveles.</w:t>
+      </w:r>
+    </w:p>
+    <w:p/>
+    <w:p>
+      <w:pPr>
+        <w:pStyle w:val="Ttulo1"/>
+      </w:pPr>
+      <w:bookmarkStart w:id="4" w:name="_heading=h.1q176bjjlmxk" w:colFirst="0" w:colLast="0"/>
+      <w:bookmarkEnd w:id="4"/>
       <w:proofErr w:type="spellStart"/>
       <w:r>
-        <w:t>proceduralmente</w:t>
-      </w:r>
-      <w:proofErr w:type="spellEnd"/>
-      <w:r>
-        <w:t>, acumulando puntos y experiencia eliminando enemigos y recogiendo tesoros. Evitando perder todas las vidas por las trampas y enemigos.</w:t>
-      </w:r>
-    </w:p>
-    <w:p>
-      <w:pPr>
-        <w:pStyle w:val="Ttulo1"/>
-      </w:pPr>
-      <w:bookmarkStart w:id="4" w:name="_heading=h.solbrmxt962v" w:colFirst="0" w:colLast="0"/>
-      <w:bookmarkEnd w:id="4"/>
-      <w:r>
-        <w:t>M</w:t>
-      </w:r>
-      <w:r>
-        <w:t>ecánicas Principales:</w:t>
-      </w:r>
-    </w:p>
-    <w:p>
-      <w:r>
-        <w:t>- Dif</w:t>
-      </w:r>
-      <w:r>
-        <w:t>icultad Progresiva: 5 niveles que aumentan en escala y variedad de obstáculos.</w:t>
-      </w:r>
-    </w:p>
-    <w:p>
-      <w:r>
-        <w:t>- Sistema de Salud y Vidas: El jugador cuenta con 3 corazones de salud. Al agotarse, pierde una de sus 3 vidas totales y reaparece con salud completa.</w:t>
-      </w:r>
-    </w:p>
-    <w:p>
-      <w:r>
-        <w:t>- Aumento de nivel: Recoge</w:t>
-      </w:r>
-      <w:r>
-        <w:t>r suficientes puntos otorga una vida extra e incrementa el nivel del jugador, dándole la opción de elegir una bonificación a sus estadísticas.</w:t>
-      </w:r>
-    </w:p>
-    <w:p>
-      <w:r>
-        <w:t>- Persistencia: La puntuación, salud, experiencia y vidas se mantienen al avanzar entre los cinco niveles.</w:t>
-      </w:r>
-    </w:p>
-    <w:p/>
-    <w:p>
-      <w:pPr>
-        <w:pStyle w:val="Ttulo1"/>
-      </w:pPr>
-      <w:bookmarkStart w:id="5" w:name="_heading=h.1q176bjjlmxk" w:colFirst="0" w:colLast="0"/>
-      <w:bookmarkEnd w:id="5"/>
-      <w:proofErr w:type="spellStart"/>
-      <w:r>
-        <w:t>N</w:t>
-      </w:r>
-      <w:r>
-        <w:t>PCs</w:t>
+        <w:t>NPCs</w:t>
       </w:r>
       <w:proofErr w:type="spellEnd"/>
       <w:r>
@@ -1386,7 +1362,7 @@
           <w:noProof/>
         </w:rPr>
         <w:drawing>
-          <wp:inline distT="0" distB="0" distL="0" distR="0">
+          <wp:inline distT="0" distB="0" distL="0" distR="0" wp14:anchorId="57D04B6A" wp14:editId="6CE9F6A0">
             <wp:extent cx="914528" cy="428685"/>
             <wp:effectExtent l="0" t="0" r="0" b="0"/>
             <wp:docPr id="52" name="image2.png"/>
@@ -1450,16 +1426,21 @@
         </w:numPr>
       </w:pPr>
       <w:r>
-        <w:t>Perseguidores (Naran</w:t>
-      </w:r>
-      <w:r>
-        <w:t>jas)</w:t>
+        <w:t>Perseguidores (Naranjas)</w:t>
       </w:r>
     </w:p>
     <w:p>
       <w:r>
         <w:lastRenderedPageBreak/>
-        <w:t>Siguen al jugador si este entra a su área, después de un rato se cansan y se ponen a dormir, resumiendo la persecución si el jugador se acerca de nuevo.</w:t>
+        <w:t xml:space="preserve">Siguen al jugador si este entra a su área, después de un rato se cansan y se ponen a dormir, </w:t>
+      </w:r>
+      <w:proofErr w:type="gramStart"/>
+      <w:r>
+        <w:t>resumiendo</w:t>
+      </w:r>
+      <w:proofErr w:type="gramEnd"/>
+      <w:r>
+        <w:t xml:space="preserve"> la persecución si el jugador se acerca de nuevo.</w:t>
       </w:r>
     </w:p>
     <w:p/>
@@ -1477,10 +1458,7 @@
     </w:p>
     <w:p>
       <w:r>
-        <w:t>Se comportan como los rojos, pero poseen una espada que gira alrededor s</w:t>
-      </w:r>
-      <w:r>
-        <w:t>uyo. Si la espada llega a apuntar al jugador, realizará un ataque teledirigido a este último.</w:t>
+        <w:t>Se comportan como los rojos, pero poseen una espada que gira alrededor suyo. Si la espada llega a apuntar al jugador, realizará un ataque teledirigido a este último.</w:t>
       </w:r>
     </w:p>
     <w:p/>
@@ -1511,7 +1489,10 @@
         <w:ind w:left="708"/>
       </w:pPr>
       <w:r>
-        <w:t>Pistoleros (Celestes)</w:t>
+        <w:t>Arqueros</w:t>
+      </w:r>
+      <w:r>
+        <w:t xml:space="preserve"> (Celestes)</w:t>
       </w:r>
     </w:p>
     <w:p>
@@ -1524,7 +1505,13 @@
       </w:r>
       <w:proofErr w:type="spellEnd"/>
       <w:r>
-        <w:t xml:space="preserve"> y las balas pueden ser bloqueadas por las armas del jugador.</w:t>
+        <w:t xml:space="preserve"> y las </w:t>
+      </w:r>
+      <w:r>
+        <w:t>flechas</w:t>
+      </w:r>
+      <w:r>
+        <w:t xml:space="preserve"> pueden ser bloqueadas por las armas del jugador.</w:t>
       </w:r>
     </w:p>
     <w:p/>
@@ -1537,7 +1524,13 @@
         <w:ind w:left="708"/>
       </w:pPr>
       <w:r>
-        <w:t>Mago Helado(Azul)</w:t>
+        <w:t>Mago Helado</w:t>
+      </w:r>
+      <w:r>
+        <w:t xml:space="preserve"> </w:t>
+      </w:r>
+      <w:r>
+        <w:t>(Azul)</w:t>
       </w:r>
     </w:p>
     <w:p>
@@ -1564,8 +1557,8 @@
           <w:between w:val="nil"/>
         </w:pBdr>
       </w:pPr>
-      <w:bookmarkStart w:id="6" w:name="_heading=h.et6ovx887kit" w:colFirst="0" w:colLast="0"/>
-      <w:bookmarkEnd w:id="6"/>
+      <w:bookmarkStart w:id="5" w:name="_heading=h.et6ovx887kit" w:colFirst="0" w:colLast="0"/>
+      <w:bookmarkEnd w:id="5"/>
       <w:r>
         <w:t>Jefe</w:t>
       </w:r>
@@ -1573,13 +1566,7 @@
         <w:rPr>
           <w:color w:val="000000"/>
         </w:rPr>
-        <w:t>: El Pollo Mo</w:t>
-      </w:r>
-      <w:r>
-        <w:rPr>
-          <w:color w:val="000000"/>
-        </w:rPr>
-        <w:t>rado</w:t>
+        <w:t>: El Pollo Morado</w:t>
       </w:r>
     </w:p>
     <w:p>
@@ -1605,7 +1592,7 @@
           <w:noProof/>
         </w:rPr>
         <w:drawing>
-          <wp:inline distT="0" distB="0" distL="0" distR="0">
+          <wp:inline distT="0" distB="0" distL="0" distR="0" wp14:anchorId="66A73F26" wp14:editId="392E8BB7">
             <wp:extent cx="1848108" cy="1362265"/>
             <wp:effectExtent l="0" t="0" r="0" b="0"/>
             <wp:docPr id="51" name="image1.png"/>
@@ -1653,7 +1640,7 @@
 </file>
 
 <file path=word/numbering.xml><?xml version="1.0" encoding="utf-8"?>
-<w:numbering xmlns:wpc="http://schemas.microsoft.com/office/word/2010/wordprocessingCanvas" xmlns:cx="http://schemas.microsoft.com/office/drawing/2014/chartex" xmlns:mc="http://schemas.openxmlformats.org/markup-compatibility/2006" xmlns:o="urn:schemas-microsoft-com:office:office" xmlns:r="http://schemas.openxmlformats.org/officeDocument/2006/relationships" xmlns:m="http://schemas.openxmlformats.org/officeDocument/2006/math" xmlns:v="urn:schemas-microsoft-com:vml" xmlns:wp14="http://schemas.microsoft.com/office/word/2010/wordprocessingDrawing" xmlns:wp="http://schemas.openxmlformats.org/drawingml/2006/wordprocessingDrawing" xmlns:w10="urn:schemas-microsoft-com:office:word" xmlns:w="http://schemas.openxmlformats.org/wordprocessingml/2006/main" xmlns:w14="http://schemas.microsoft.com/office/word/2010/wordml" xmlns:w15="http://schemas.microsoft.com/office/word/2012/wordml" xmlns:w16se="http://schemas.microsoft.com/office/word/2015/wordml/symex" xmlns:wpg="http://schemas.microsoft.com/office/word/2010/wordprocessingGroup" xmlns:wpi="http://schemas.microsoft.com/office/word/2010/wordprocessingInk" xmlns:wne="http://schemas.microsoft.com/office/word/2006/wordml" xmlns:wps="http://schemas.microsoft.com/office/word/2010/wordprocessingShape" mc:Ignorable="w14 w15 w16se wp14">
+<w:numbering xmlns:wpc="http://schemas.microsoft.com/office/word/2010/wordprocessingCanvas" xmlns:cx="http://schemas.microsoft.com/office/drawing/2014/chartex" xmlns:cx1="http://schemas.microsoft.com/office/drawing/2015/9/8/chartex" xmlns:cx2="http://schemas.microsoft.com/office/drawing/2015/10/21/chartex" xmlns:cx3="http://schemas.microsoft.com/office/drawing/2016/5/9/chartex" xmlns:cx4="http://schemas.microsoft.com/office/drawing/2016/5/10/chartex" xmlns:cx5="http://schemas.microsoft.com/office/drawing/2016/5/11/chartex" xmlns:cx6="http://schemas.microsoft.com/office/drawing/2016/5/12/chartex" xmlns:cx7="http://schemas.microsoft.com/office/drawing/2016/5/13/chartex" xmlns:cx8="http://schemas.microsoft.com/office/drawing/2016/5/14/chartex" xmlns:mc="http://schemas.openxmlformats.org/markup-compatibility/2006" xmlns:aink="http://schemas.microsoft.com/office/drawing/2016/ink" xmlns:am3d="http://schemas.microsoft.com/office/drawing/2017/model3d" xmlns:o="urn:schemas-microsoft-com:office:office" xmlns:oel="http://schemas.microsoft.com/office/2019/extlst" xmlns:r="http://schemas.openxmlformats.org/officeDocument/2006/relationships" xmlns:m="http://schemas.openxmlformats.org/officeDocument/2006/math" xmlns:v="urn:schemas-microsoft-com:vml" xmlns:wp14="http://schemas.microsoft.com/office/word/2010/wordprocessingDrawing" xmlns:wp="http://schemas.openxmlformats.org/drawingml/2006/wordprocessingDrawing" xmlns:w10="urn:schemas-microsoft-com:office:word" xmlns:w="http://schemas.openxmlformats.org/wordprocessingml/2006/main" xmlns:w14="http://schemas.microsoft.com/office/word/2010/wordml" xmlns:w15="http://schemas.microsoft.com/office/word/2012/wordml" xmlns:w16cex="http://schemas.microsoft.com/office/word/2018/wordml/cex" xmlns:w16cid="http://schemas.microsoft.com/office/word/2016/wordml/cid" xmlns:w16="http://schemas.microsoft.com/office/word/2018/wordml" xmlns:w16sdtdh="http://schemas.microsoft.com/office/word/2020/wordml/sdtdatahash" xmlns:w16se="http://schemas.microsoft.com/office/word/2015/wordml/symex" xmlns:wpg="http://schemas.microsoft.com/office/word/2010/wordprocessingGroup" xmlns:wpi="http://schemas.microsoft.com/office/word/2010/wordprocessingInk" xmlns:wne="http://schemas.microsoft.com/office/word/2006/wordml" xmlns:wps="http://schemas.microsoft.com/office/word/2010/wordprocessingShape" mc:Ignorable="w14 w15 w16se w16cid w16 w16cex w16sdtdh wp14">
   <w:abstractNum w:abstractNumId="0" w15:restartNumberingAfterBreak="0">
     <w:nsid w:val="42631D2A"/>
     <w:multiLevelType w:val="multilevel"/>
@@ -1886,17 +1873,17 @@
       </w:rPr>
     </w:lvl>
   </w:abstractNum>
-  <w:num w:numId="1">
+  <w:num w:numId="1" w16cid:durableId="1927423536">
     <w:abstractNumId w:val="0"/>
   </w:num>
-  <w:num w:numId="2">
+  <w:num w:numId="2" w16cid:durableId="417285808">
     <w:abstractNumId w:val="1"/>
   </w:num>
 </w:numbering>
 </file>
 
 <file path=word/styles.xml><?xml version="1.0" encoding="utf-8"?>
-<w:styles xmlns:mc="http://schemas.openxmlformats.org/markup-compatibility/2006" xmlns:r="http://schemas.openxmlformats.org/officeDocument/2006/relationships" xmlns:w="http://schemas.openxmlformats.org/wordprocessingml/2006/main" xmlns:w14="http://schemas.microsoft.com/office/word/2010/wordml" xmlns:w15="http://schemas.microsoft.com/office/word/2012/wordml" xmlns:w16se="http://schemas.microsoft.com/office/word/2015/wordml/symex" mc:Ignorable="w14 w15 w16se">
+<w:styles xmlns:mc="http://schemas.openxmlformats.org/markup-compatibility/2006" xmlns:r="http://schemas.openxmlformats.org/officeDocument/2006/relationships" xmlns:w="http://schemas.openxmlformats.org/wordprocessingml/2006/main" xmlns:w14="http://schemas.microsoft.com/office/word/2010/wordml" xmlns:w15="http://schemas.microsoft.com/office/word/2012/wordml" xmlns:w16cex="http://schemas.microsoft.com/office/word/2018/wordml/cex" xmlns:w16cid="http://schemas.microsoft.com/office/word/2016/wordml/cid" xmlns:w16="http://schemas.microsoft.com/office/word/2018/wordml" xmlns:w16sdtdh="http://schemas.microsoft.com/office/word/2020/wordml/sdtdatahash" xmlns:w16se="http://schemas.microsoft.com/office/word/2015/wordml/symex" mc:Ignorable="w14 w15 w16se w16cid w16 w16cex w16sdtdh">
   <w:docDefaults>
     <w:rPrDefault>
       <w:rPr>
@@ -1912,7 +1899,7 @@
       </w:pPr>
     </w:pPrDefault>
   </w:docDefaults>
-  <w:latentStyles w:defLockedState="0" w:defUIPriority="99" w:defSemiHidden="0" w:defUnhideWhenUsed="0" w:defQFormat="0" w:count="371">
+  <w:latentStyles w:defLockedState="0" w:defUIPriority="99" w:defSemiHidden="0" w:defUnhideWhenUsed="0" w:defQFormat="0" w:count="376">
     <w:lsdException w:name="Normal" w:uiPriority="0" w:qFormat="1"/>
     <w:lsdException w:name="heading 1" w:uiPriority="9" w:qFormat="1"/>
     <w:lsdException w:name="heading 2" w:semiHidden="1" w:uiPriority="9" w:unhideWhenUsed="1" w:qFormat="1"/>
@@ -2284,6 +2271,11 @@
     <w:lsdException w:name="List Table 5 Dark Accent 6" w:uiPriority="50"/>
     <w:lsdException w:name="List Table 6 Colorful Accent 6" w:uiPriority="51"/>
     <w:lsdException w:name="List Table 7 Colorful Accent 6" w:uiPriority="52"/>
+    <w:lsdException w:name="Mention" w:semiHidden="1" w:unhideWhenUsed="1"/>
+    <w:lsdException w:name="Smart Hyperlink" w:semiHidden="1" w:unhideWhenUsed="1"/>
+    <w:lsdException w:name="Hashtag" w:semiHidden="1" w:unhideWhenUsed="1"/>
+    <w:lsdException w:name="Unresolved Mention" w:semiHidden="1" w:unhideWhenUsed="1"/>
+    <w:lsdException w:name="Smart Link" w:semiHidden="1" w:unhideWhenUsed="1"/>
   </w:latentStyles>
   <w:style w:type="paragraph" w:default="1" w:styleId="Normal">
     <w:name w:val="Normal"/>

</xml_diff>